<commit_message>
What You told Us: label vessel 2 as PWC / Jet Ski 2, drop payment section
Co-Authored-By: Claude Sonnet 5.5 <noreply@anthropic.com>
Claude-Session: https://claude.ai/code/session_0115Be2uDFjMy2GUw7hcB9dS
</commit_message>
<xml_diff>
--- a/docs/Jet-Ski-What-You-Told-Us.docx
+++ b/docs/Jet-Ski-What-You-Told-Us.docx
@@ -3785,87 +3785,7 @@
                 <w:sz w:val="20"/>
                 <w:szCs w:val="20"/>
               </w:rPr>
-              <w:t>Additional PWC / Jet Ski</w:t>
-            </w:r>
-          </w:p>
-        </w:tc>
-      </w:tr>
-      <w:tr>
-        <w:trPr>
-          <w:cantSplit/>
-        </w:trPr>
-        <w:tc>
-          <w:tcPr>
-            <w:tcW w:type="dxa" w:w="4228"/>
-            <w:tcBorders>
-              <w:top w:val="none" w:color="FFFFFF" w:sz="0"/>
-              <w:left w:val="single" w:color="C9E3EA" w:sz="6"/>
-              <w:bottom w:val="single" w:color="DDE3E6" w:sz="4"/>
-              <w:right w:val="none" w:color="FFFFFF" w:sz="0"/>
-            </w:tcBorders>
-            <w:shd w:fill="F3F5F6" w:color="auto" w:val="clear"/>
-            <w:tcMar>
-              <w:top w:type="dxa" w:w="32"/>
-              <w:left w:type="dxa" w:w="220"/>
-              <w:bottom w:type="dxa" w:w="32"/>
-              <w:right w:type="dxa" w:w="60"/>
-            </w:tcMar>
-            <w:vAlign w:val="center"/>
-          </w:tcPr>
-          <w:p>
-            <w:pPr>
-              <w:keepNext/>
-              <w:keepLines/>
-              <w:spacing w:before="0" w:after="0"/>
-            </w:pPr>
-            <w:r>
-              <w:rPr>
-                <w:rFonts w:ascii="Arial" w:hAnsi="Arial" w:cs="Arial" w:eastAsia="Arial"/>
-                <w:b w:val="false"/>
-                <w:bCs w:val="false"/>
-                <w:color w:val="3C4A50"/>
-                <w:sz w:val="18"/>
-                <w:szCs w:val="18"/>
-              </w:rPr>
-              <w:t>Additional PWC / Jet Ski to insure</w:t>
-            </w:r>
-          </w:p>
-        </w:tc>
-        <w:tc>
-          <w:tcPr>
-            <w:tcW w:type="dxa" w:w="6078"/>
-            <w:tcBorders>
-              <w:top w:val="none" w:color="FFFFFF" w:sz="0"/>
-              <w:left w:val="none" w:color="FFFFFF" w:sz="0"/>
-              <w:bottom w:val="single" w:color="DDE3E6" w:sz="4"/>
-              <w:right w:val="single" w:color="C9E3EA" w:sz="6"/>
-            </w:tcBorders>
-            <w:shd w:fill="F3F5F6" w:color="auto" w:val="clear"/>
-            <w:tcMar>
-              <w:top w:type="dxa" w:w="32"/>
-              <w:left w:type="dxa" w:w="60"/>
-              <w:bottom w:type="dxa" w:w="32"/>
-              <w:right w:type="dxa" w:w="220"/>
-            </w:tcMar>
-            <w:vAlign w:val="center"/>
-          </w:tcPr>
-          <w:p>
-            <w:pPr>
-              <w:keepNext/>
-              <w:keepLines/>
-              <w:spacing w:before="0" w:after="0"/>
-              <w:jc w:val="right"/>
-            </w:pPr>
-            <w:r>
-              <w:rPr>
-                <w:rFonts w:ascii="Arial" w:hAnsi="Arial" w:cs="Arial" w:eastAsia="Arial"/>
-                <w:b/>
-                <w:bCs/>
-                <w:color w:val="000000"/>
-                <w:sz w:val="18"/>
-                <w:szCs w:val="18"/>
-              </w:rPr>
-              <w:t>Yes</w:t>
+              <w:t>PWC / Jet Ski 2 Details</w:t>
             </w:r>
           </w:p>
         </w:tc>
@@ -7742,475 +7662,6 @@
                 <w:szCs w:val="18"/>
               </w:rPr>
               <w:t>3 files: photographs of both PWC / Jet Skis and the trailer</w:t>
-            </w:r>
-          </w:p>
-        </w:tc>
-      </w:tr>
-    </w:tbl>
-    <w:p>
-      <w:pPr>
-        <w:spacing w:before="0" w:after="0" w:line="140" w:lineRule="exact"/>
-        <w:rPr>
-          <w:sz w:val="2"/>
-        </w:rPr>
-      </w:pPr>
-    </w:p>
-    <w:tbl>
-      <w:tblPr>
-        <w:tblW w:type="dxa" w:w="10306"/>
-        <w:tblBorders>
-          <w:top w:val="none" w:color="FFFFFF" w:sz="0"/>
-          <w:left w:val="none" w:color="FFFFFF" w:sz="0"/>
-          <w:bottom w:val="none" w:color="FFFFFF" w:sz="0"/>
-          <w:right w:val="none" w:color="FFFFFF" w:sz="0"/>
-          <w:insideH w:val="none" w:color="FFFFFF" w:sz="0"/>
-          <w:insideV w:val="none" w:color="FFFFFF" w:sz="0"/>
-        </w:tblBorders>
-        <w:tblLayout w:type="fixed"/>
-      </w:tblPr>
-      <w:tblGrid>
-        <w:gridCol w:w="4228"/>
-        <w:gridCol w:w="6078"/>
-      </w:tblGrid>
-      <w:tr>
-        <w:trPr>
-          <w:cantSplit/>
-        </w:trPr>
-        <w:tc>
-          <w:tcPr>
-            <w:tcW w:type="dxa" w:w="10306"/>
-            <w:gridSpan w:val="2"/>
-            <w:tcBorders>
-              <w:top w:val="single" w:color="C9E3EA" w:sz="6"/>
-              <w:left w:val="single" w:color="C9E3EA" w:sz="6"/>
-              <w:bottom w:val="none" w:color="FFFFFF" w:sz="0"/>
-              <w:right w:val="single" w:color="C9E3EA" w:sz="6"/>
-            </w:tcBorders>
-            <w:shd w:fill="E6F4F8" w:color="auto" w:val="clear"/>
-            <w:tcMar>
-              <w:top w:type="dxa" w:w="60"/>
-              <w:left w:type="dxa" w:w="220"/>
-              <w:bottom w:type="dxa" w:w="60"/>
-              <w:right w:type="dxa" w:w="220"/>
-            </w:tcMar>
-            <w:vAlign w:val="center"/>
-          </w:tcPr>
-          <w:p>
-            <w:pPr>
-              <w:keepNext/>
-              <w:keepLines/>
-              <w:spacing w:before="0" w:after="0"/>
-            </w:pPr>
-            <w:r>
-              <w:rPr>
-                <w:rFonts w:ascii="Arial" w:hAnsi="Arial" w:cs="Arial" w:eastAsia="Arial"/>
-                <w:b/>
-                <w:bCs/>
-                <w:color w:val="02637D"/>
-                <w:sz w:val="20"/>
-                <w:szCs w:val="20"/>
-              </w:rPr>
-              <w:t>Payment</w:t>
-            </w:r>
-          </w:p>
-        </w:tc>
-      </w:tr>
-      <w:tr>
-        <w:trPr>
-          <w:cantSplit/>
-        </w:trPr>
-        <w:tc>
-          <w:tcPr>
-            <w:tcW w:type="dxa" w:w="4228"/>
-            <w:tcBorders>
-              <w:top w:val="none" w:color="FFFFFF" w:sz="0"/>
-              <w:left w:val="single" w:color="C9E3EA" w:sz="6"/>
-              <w:bottom w:val="single" w:color="DDE3E6" w:sz="4"/>
-              <w:right w:val="none" w:color="FFFFFF" w:sz="0"/>
-            </w:tcBorders>
-            <w:shd w:fill="F3F5F6" w:color="auto" w:val="clear"/>
-            <w:tcMar>
-              <w:top w:type="dxa" w:w="32"/>
-              <w:left w:type="dxa" w:w="220"/>
-              <w:bottom w:type="dxa" w:w="32"/>
-              <w:right w:type="dxa" w:w="60"/>
-            </w:tcMar>
-            <w:vAlign w:val="center"/>
-          </w:tcPr>
-          <w:p>
-            <w:pPr>
-              <w:keepNext/>
-              <w:keepLines/>
-              <w:spacing w:before="0" w:after="0"/>
-            </w:pPr>
-            <w:r>
-              <w:rPr>
-                <w:rFonts w:ascii="Arial" w:hAnsi="Arial" w:cs="Arial" w:eastAsia="Arial"/>
-                <w:b w:val="false"/>
-                <w:bCs w:val="false"/>
-                <w:color w:val="3C4A50"/>
-                <w:sz w:val="18"/>
-                <w:szCs w:val="18"/>
-              </w:rPr>
-              <w:t>Annual premium payable</w:t>
-            </w:r>
-          </w:p>
-        </w:tc>
-        <w:tc>
-          <w:tcPr>
-            <w:tcW w:type="dxa" w:w="6078"/>
-            <w:tcBorders>
-              <w:top w:val="none" w:color="FFFFFF" w:sz="0"/>
-              <w:left w:val="none" w:color="FFFFFF" w:sz="0"/>
-              <w:bottom w:val="single" w:color="DDE3E6" w:sz="4"/>
-              <w:right w:val="single" w:color="C9E3EA" w:sz="6"/>
-            </w:tcBorders>
-            <w:shd w:fill="F3F5F6" w:color="auto" w:val="clear"/>
-            <w:tcMar>
-              <w:top w:type="dxa" w:w="32"/>
-              <w:left w:type="dxa" w:w="60"/>
-              <w:bottom w:type="dxa" w:w="32"/>
-              <w:right w:type="dxa" w:w="220"/>
-            </w:tcMar>
-            <w:vAlign w:val="center"/>
-          </w:tcPr>
-          <w:p>
-            <w:pPr>
-              <w:keepNext/>
-              <w:keepLines/>
-              <w:spacing w:before="0" w:after="0"/>
-              <w:jc w:val="right"/>
-            </w:pPr>
-            <w:r>
-              <w:rPr>
-                <w:rFonts w:ascii="Arial" w:hAnsi="Arial" w:cs="Arial" w:eastAsia="Arial"/>
-                <w:b/>
-                <w:bCs/>
-                <w:color w:val="000000"/>
-                <w:sz w:val="18"/>
-                <w:szCs w:val="18"/>
-              </w:rPr>
-              <w:t>$2,148.89</w:t>
-            </w:r>
-          </w:p>
-        </w:tc>
-      </w:tr>
-      <w:tr>
-        <w:trPr>
-          <w:cantSplit/>
-        </w:trPr>
-        <w:tc>
-          <w:tcPr>
-            <w:tcW w:type="dxa" w:w="4228"/>
-            <w:tcBorders>
-              <w:top w:val="none" w:color="FFFFFF" w:sz="0"/>
-              <w:left w:val="single" w:color="C9E3EA" w:sz="6"/>
-              <w:bottom w:val="single" w:color="DDE3E6" w:sz="4"/>
-              <w:right w:val="none" w:color="FFFFFF" w:sz="0"/>
-            </w:tcBorders>
-            <w:shd w:fill="F3F5F6" w:color="auto" w:val="clear"/>
-            <w:tcMar>
-              <w:top w:type="dxa" w:w="32"/>
-              <w:left w:type="dxa" w:w="220"/>
-              <w:bottom w:type="dxa" w:w="32"/>
-              <w:right w:type="dxa" w:w="60"/>
-            </w:tcMar>
-            <w:vAlign w:val="center"/>
-          </w:tcPr>
-          <w:p>
-            <w:pPr>
-              <w:keepNext/>
-              <w:keepLines/>
-              <w:spacing w:before="0" w:after="0"/>
-            </w:pPr>
-            <w:r>
-              <w:rPr>
-                <w:rFonts w:ascii="Arial" w:hAnsi="Arial" w:cs="Arial" w:eastAsia="Arial"/>
-                <w:b w:val="false"/>
-                <w:bCs w:val="false"/>
-                <w:color w:val="3C4A50"/>
-                <w:sz w:val="18"/>
-                <w:szCs w:val="18"/>
-              </w:rPr>
-              <w:t>Payment option</w:t>
-            </w:r>
-          </w:p>
-        </w:tc>
-        <w:tc>
-          <w:tcPr>
-            <w:tcW w:type="dxa" w:w="6078"/>
-            <w:tcBorders>
-              <w:top w:val="none" w:color="FFFFFF" w:sz="0"/>
-              <w:left w:val="none" w:color="FFFFFF" w:sz="0"/>
-              <w:bottom w:val="single" w:color="DDE3E6" w:sz="4"/>
-              <w:right w:val="single" w:color="C9E3EA" w:sz="6"/>
-            </w:tcBorders>
-            <w:shd w:fill="F3F5F6" w:color="auto" w:val="clear"/>
-            <w:tcMar>
-              <w:top w:type="dxa" w:w="32"/>
-              <w:left w:type="dxa" w:w="60"/>
-              <w:bottom w:type="dxa" w:w="32"/>
-              <w:right w:type="dxa" w:w="220"/>
-            </w:tcMar>
-            <w:vAlign w:val="center"/>
-          </w:tcPr>
-          <w:p>
-            <w:pPr>
-              <w:keepNext/>
-              <w:keepLines/>
-              <w:spacing w:before="0" w:after="0"/>
-              <w:jc w:val="right"/>
-            </w:pPr>
-            <w:r>
-              <w:rPr>
-                <w:rFonts w:ascii="Arial" w:hAnsi="Arial" w:cs="Arial" w:eastAsia="Arial"/>
-                <w:b/>
-                <w:bCs/>
-                <w:color w:val="000000"/>
-                <w:sz w:val="18"/>
-                <w:szCs w:val="18"/>
-              </w:rPr>
-              <w:t>Credit / Debit Card</w:t>
-            </w:r>
-          </w:p>
-        </w:tc>
-      </w:tr>
-      <w:tr>
-        <w:trPr>
-          <w:cantSplit/>
-        </w:trPr>
-        <w:tc>
-          <w:tcPr>
-            <w:tcW w:type="dxa" w:w="4228"/>
-            <w:tcBorders>
-              <w:top w:val="none" w:color="FFFFFF" w:sz="0"/>
-              <w:left w:val="single" w:color="C9E3EA" w:sz="6"/>
-              <w:bottom w:val="single" w:color="DDE3E6" w:sz="4"/>
-              <w:right w:val="none" w:color="FFFFFF" w:sz="0"/>
-            </w:tcBorders>
-            <w:shd w:fill="F3F5F6" w:color="auto" w:val="clear"/>
-            <w:tcMar>
-              <w:top w:type="dxa" w:w="32"/>
-              <w:left w:type="dxa" w:w="220"/>
-              <w:bottom w:type="dxa" w:w="32"/>
-              <w:right w:type="dxa" w:w="60"/>
-            </w:tcMar>
-            <w:vAlign w:val="center"/>
-          </w:tcPr>
-          <w:p>
-            <w:pPr>
-              <w:keepNext/>
-              <w:keepLines/>
-              <w:spacing w:before="0" w:after="0"/>
-            </w:pPr>
-            <w:r>
-              <w:rPr>
-                <w:rFonts w:ascii="Arial" w:hAnsi="Arial" w:cs="Arial" w:eastAsia="Arial"/>
-                <w:b w:val="false"/>
-                <w:bCs w:val="false"/>
-                <w:color w:val="3C4A50"/>
-                <w:sz w:val="18"/>
-                <w:szCs w:val="18"/>
-              </w:rPr>
-              <w:t>Card type</w:t>
-            </w:r>
-          </w:p>
-        </w:tc>
-        <w:tc>
-          <w:tcPr>
-            <w:tcW w:type="dxa" w:w="6078"/>
-            <w:tcBorders>
-              <w:top w:val="none" w:color="FFFFFF" w:sz="0"/>
-              <w:left w:val="none" w:color="FFFFFF" w:sz="0"/>
-              <w:bottom w:val="single" w:color="DDE3E6" w:sz="4"/>
-              <w:right w:val="single" w:color="C9E3EA" w:sz="6"/>
-            </w:tcBorders>
-            <w:shd w:fill="F3F5F6" w:color="auto" w:val="clear"/>
-            <w:tcMar>
-              <w:top w:type="dxa" w:w="32"/>
-              <w:left w:type="dxa" w:w="60"/>
-              <w:bottom w:type="dxa" w:w="32"/>
-              <w:right w:type="dxa" w:w="220"/>
-            </w:tcMar>
-            <w:vAlign w:val="center"/>
-          </w:tcPr>
-          <w:p>
-            <w:pPr>
-              <w:keepNext/>
-              <w:keepLines/>
-              <w:spacing w:before="0" w:after="0"/>
-              <w:jc w:val="right"/>
-            </w:pPr>
-            <w:r>
-              <w:rPr>
-                <w:rFonts w:ascii="Arial" w:hAnsi="Arial" w:cs="Arial" w:eastAsia="Arial"/>
-                <w:b/>
-                <w:bCs/>
-                <w:color w:val="000000"/>
-                <w:sz w:val="18"/>
-                <w:szCs w:val="18"/>
-              </w:rPr>
-              <w:t>Visa Credit</w:t>
-            </w:r>
-          </w:p>
-        </w:tc>
-      </w:tr>
-      <w:tr>
-        <w:trPr>
-          <w:cantSplit/>
-        </w:trPr>
-        <w:tc>
-          <w:tcPr>
-            <w:tcW w:type="dxa" w:w="4228"/>
-            <w:tcBorders>
-              <w:top w:val="none" w:color="FFFFFF" w:sz="0"/>
-              <w:left w:val="single" w:color="C9E3EA" w:sz="6"/>
-              <w:bottom w:val="single" w:color="DDE3E6" w:sz="4"/>
-              <w:right w:val="none" w:color="FFFFFF" w:sz="0"/>
-            </w:tcBorders>
-            <w:shd w:fill="F3F5F6" w:color="auto" w:val="clear"/>
-            <w:tcMar>
-              <w:top w:type="dxa" w:w="32"/>
-              <w:left w:type="dxa" w:w="220"/>
-              <w:bottom w:type="dxa" w:w="32"/>
-              <w:right w:type="dxa" w:w="60"/>
-            </w:tcMar>
-            <w:vAlign w:val="center"/>
-          </w:tcPr>
-          <w:p>
-            <w:pPr>
-              <w:keepNext/>
-              <w:keepLines/>
-              <w:spacing w:before="0" w:after="0"/>
-            </w:pPr>
-            <w:r>
-              <w:rPr>
-                <w:rFonts w:ascii="Arial" w:hAnsi="Arial" w:cs="Arial" w:eastAsia="Arial"/>
-                <w:b w:val="false"/>
-                <w:bCs w:val="false"/>
-                <w:color w:val="3C4A50"/>
-                <w:sz w:val="18"/>
-                <w:szCs w:val="18"/>
-              </w:rPr>
-              <w:t>Cardholder name</w:t>
-            </w:r>
-          </w:p>
-        </w:tc>
-        <w:tc>
-          <w:tcPr>
-            <w:tcW w:type="dxa" w:w="6078"/>
-            <w:tcBorders>
-              <w:top w:val="none" w:color="FFFFFF" w:sz="0"/>
-              <w:left w:val="none" w:color="FFFFFF" w:sz="0"/>
-              <w:bottom w:val="single" w:color="DDE3E6" w:sz="4"/>
-              <w:right w:val="single" w:color="C9E3EA" w:sz="6"/>
-            </w:tcBorders>
-            <w:shd w:fill="F3F5F6" w:color="auto" w:val="clear"/>
-            <w:tcMar>
-              <w:top w:type="dxa" w:w="32"/>
-              <w:left w:type="dxa" w:w="60"/>
-              <w:bottom w:type="dxa" w:w="32"/>
-              <w:right w:type="dxa" w:w="220"/>
-            </w:tcMar>
-            <w:vAlign w:val="center"/>
-          </w:tcPr>
-          <w:p>
-            <w:pPr>
-              <w:keepNext/>
-              <w:keepLines/>
-              <w:spacing w:before="0" w:after="0"/>
-              <w:jc w:val="right"/>
-            </w:pPr>
-            <w:r>
-              <w:rPr>
-                <w:rFonts w:ascii="Arial" w:hAnsi="Arial" w:cs="Arial" w:eastAsia="Arial"/>
-                <w:b/>
-                <w:bCs/>
-                <w:color w:val="000000"/>
-                <w:sz w:val="18"/>
-                <w:szCs w:val="18"/>
-              </w:rPr>
-              <w:t>Daniel Whitfield</w:t>
-            </w:r>
-          </w:p>
-        </w:tc>
-      </w:tr>
-      <w:tr>
-        <w:trPr>
-          <w:cantSplit/>
-        </w:trPr>
-        <w:tc>
-          <w:tcPr>
-            <w:tcW w:type="dxa" w:w="4228"/>
-            <w:tcBorders>
-              <w:top w:val="none" w:color="FFFFFF" w:sz="0"/>
-              <w:left w:val="single" w:color="C9E3EA" w:sz="6"/>
-              <w:bottom w:val="single" w:color="DDE3E6" w:sz="4"/>
-              <w:right w:val="none" w:color="FFFFFF" w:sz="0"/>
-            </w:tcBorders>
-            <w:shd w:fill="F3F5F6" w:color="auto" w:val="clear"/>
-            <w:tcMar>
-              <w:top w:type="dxa" w:w="32"/>
-              <w:left w:type="dxa" w:w="220"/>
-              <w:bottom w:type="dxa" w:w="32"/>
-              <w:right w:type="dxa" w:w="60"/>
-            </w:tcMar>
-            <w:vAlign w:val="center"/>
-          </w:tcPr>
-          <w:p>
-            <w:pPr>
-              <w:keepNext/>
-              <w:keepLines/>
-              <w:spacing w:before="0" w:after="0"/>
-            </w:pPr>
-            <w:r>
-              <w:rPr>
-                <w:rFonts w:ascii="Arial" w:hAnsi="Arial" w:cs="Arial" w:eastAsia="Arial"/>
-                <w:b w:val="false"/>
-                <w:bCs w:val="false"/>
-                <w:color w:val="3C4A50"/>
-                <w:sz w:val="18"/>
-                <w:szCs w:val="18"/>
-              </w:rPr>
-              <w:t>Card number</w:t>
-            </w:r>
-          </w:p>
-        </w:tc>
-        <w:tc>
-          <w:tcPr>
-            <w:tcW w:type="dxa" w:w="6078"/>
-            <w:tcBorders>
-              <w:top w:val="none" w:color="FFFFFF" w:sz="0"/>
-              <w:left w:val="none" w:color="FFFFFF" w:sz="0"/>
-              <w:bottom w:val="single" w:color="DDE3E6" w:sz="4"/>
-              <w:right w:val="single" w:color="C9E3EA" w:sz="6"/>
-            </w:tcBorders>
-            <w:shd w:fill="F3F5F6" w:color="auto" w:val="clear"/>
-            <w:tcMar>
-              <w:top w:type="dxa" w:w="32"/>
-              <w:left w:type="dxa" w:w="60"/>
-              <w:bottom w:type="dxa" w:w="32"/>
-              <w:right w:type="dxa" w:w="220"/>
-            </w:tcMar>
-            <w:vAlign w:val="center"/>
-          </w:tcPr>
-          <w:p>
-            <w:pPr>
-              <w:keepNext/>
-              <w:keepLines/>
-              <w:spacing w:before="0" w:after="0"/>
-              <w:jc w:val="right"/>
-            </w:pPr>
-            <w:r>
-              <w:rPr>
-                <w:rFonts w:ascii="Arial" w:hAnsi="Arial" w:cs="Arial" w:eastAsia="Arial"/>
-                <w:b/>
-                <w:bCs/>
-                <w:color w:val="000000"/>
-                <w:sz w:val="18"/>
-                <w:szCs w:val="18"/>
-              </w:rPr>
-              <w:t>**** **** **** 4242</w:t>
             </w:r>
           </w:p>
         </w:tc>

</xml_diff>